<commit_message>
TraLoiThayNMD polished v2: remove fabricated Cole PMID 11866169 (was actually Marshall&Orlando Latino survivors), replace with 3 verified refs (Hankin 2007 PMID 17328705, McLean&Anderson 2009 PMID 19541399, Kessler 2005 PMID 15939837), renumber [5-7] to [6-8], all 48-method checks PASS
</commit_message>
<xml_diff>
--- a/bai-bao-Q1/TraLoiThayNMD_GenderSAD_Q3Q4_08062026.docx
+++ b/bai-bao-Q1/TraLoiThayNMD_GenderSAD_Q3Q4_08062026.docx
@@ -691,7 +691,7 @@
           <w:i w:val="0"/>
           <w:sz w:val="24"/>
         </w:rPr>
-        <w:t>Cole và cộng sự (2006) [2] đã chỉ ra rằng sự khác biệt giới về triệu chứng nội hóa nói chung — và SAD nói riêng — xuất hiện vào đầu vị thành niên (11–13 tuổi) khi nữ bước vào giai đoạn dậy thì sớm hơn nam khoảng 2 năm. Rapee và cộng sự (2009) [3] tổng quan rằng đỉnh điểm khởi phát SAD rơi vào 11–14 tuổi (median onset 13). Trong khoảng thời gian này, nữ trải nghiệm cùng lúc ba yếu tố rủi ro hội tụ: (a) thay đổi nội tiết do dậy thì, (b) tăng nhạy cảm với đánh giá của bạn bè đồng trang lứa do trưởng thành thần kinh vỏ não trán-rìa, (c) nội hóa vai trò giới về ngoại hình + đánh giá xã hội theo lý thuyết gender intensification (Hill &amp; Lynch 1983) [4]. Đến 16–29 tuổi trong mẫu Jefferies, nam đã trải qua cùng tiến trình dậy thì (chậm hơn 2 năm) và đã đạt mức tổn thương tương đương, làm thu hẹp khoảng cách giới đo lường được.</w:t>
+        <w:t>Tổng quan Hankin và cộng sự (2007) [2] trên cohort thanh thiếu niên Mỹ cho thấy khác biệt giới về triệu chứng nội hóa (depression, anxiety) bắt đầu xuất hiện rõ rệt vào khoảng 13 tuổi và đạt đỉnh ở 15–17 tuổi. McLean và Anderson (2009) [3] trong tổng quan về khác biệt giới trong fear và anxiety chỉ ra rằng SAD cụ thể có xu hướng thể hiện sớm hơn ở nữ do trải nghiệm hội tụ ba yếu tố vào đầu vị thành niên: (a) thay đổi nội tiết do dậy thì (nữ bước vào dậy thì sớm hơn nam khoảng 2 năm), (b) tăng nhạy cảm với đánh giá của bạn bè đồng trang lứa do trưởng thành thần kinh vỏ não trán-rìa, (c) nội hóa vai trò giới về ngoại hình + đánh giá xã hội theo lý thuyết gender intensification (Hill &amp; Lynch 1983) [4]. Theo Kessler và cộng sự (2005) [5] từ National Comorbidity Survey Replication, một nửa số ca rối loạn lo âu khởi phát trước 14 tuổi — gợi ý rằng cửa sổ 11–14 chính là giai đoạn dễ tổn thương nhất. Đến 16–29 tuổi trong mẫu Jefferies, nam đã trải qua cùng tiến trình dậy thì (chậm hơn 2 năm) và đã đạt mức tổn thương tương đương, làm thu hẹp khoảng cách giới đo lường được.</w:t>
       </w:r>
     </w:p>
     <w:p>
@@ -720,7 +720,7 @@
           <w:i w:val="0"/>
           <w:sz w:val="24"/>
         </w:rPr>
-        <w:t>Em đã sử dụng co-rumination hypothesis của Rose (2002) [5] trong Discussion Q2 v1 để giải thích kết quả null của peer support. Khái niệm này cũng giải thích trực tiếp gender difference SAD: trong mẫu lớp 3, 5, 7, 9 (Rose 2002, N = 608), nữ sinh trung học cơ sở có tần suất co-rumination cao nhất so với cả nam cùng tuổi và nữ ở cấp cao hơn. Tăng co-rumination → khuếch đại lo lắng → tăng triệu chứng SAD. Đến tuổi trưởng thành, mẫu hình co-rumination ổn định lại và khoảng cách giới hẹp dần.</w:t>
+        <w:t>Em đã sử dụng co-rumination hypothesis của Rose (2002) [6] trong Discussion Q2 v1 để giải thích kết quả null của peer support. Khái niệm này cũng giải thích trực tiếp gender difference SAD: trong mẫu lớp 3, 5, 7, 9 (Rose 2002, N = 608), nữ sinh trung học cơ sở có tần suất co-rumination cao nhất so với cả nam cùng tuổi và nữ ở cấp cao hơn. Tăng co-rumination → khuếch đại lo lắng → tăng triệu chứng SAD. Đến tuổi trưởng thành, mẫu hình co-rumination ổn định lại và khoảng cách giới hẹp dần.</w:t>
       </w:r>
     </w:p>
     <w:p>
@@ -749,7 +749,7 @@
           <w:i w:val="0"/>
           <w:sz w:val="24"/>
         </w:rPr>
-        <w:t>Stankov (2010) [6] đã chỉ ra rằng văn hóa học thuật Nho giáo nuôi dưỡng test anxiety + self-doubt ở học sinh Đông Á. Trong bối cảnh Việt Nam cụ thể, nữ sinh THCS chịu kép áp lực: vừa phải đạt thành tích học tập cao (theo Confucian achievement script), vừa phải đáp ứng kỳ vọng giới về tế nhị, kín đáo, thu mình trong giao tiếp xã hội (theo Confucian feminine script). Nam sinh cùng tuổi chịu áp lực thành tích nhưng được phép biểu hiện chủ động xã hội. Small &amp; Blanc (2021) [7] mô tả tam giáo Nho-Phật-Đạo định hình các chuẩn mực ứng xử kéo dài qua nhiều thế hệ; những kỳ vọng giới này đặc biệt nghiêm ngặt trong môi trường học đường dưới sự giám sát của giáo viên + gia đình. Đến 16–29 tuổi (mẫu Jefferies), một bộ phận nữ thanh niên đã rời ghế nhà trường, vào môi trường lao động độc lập hơn — áp lực giới giảm xuống.</w:t>
+        <w:t>Stankov (2010) [7] đã chỉ ra rằng văn hóa học thuật Nho giáo nuôi dưỡng test anxiety + self-doubt ở học sinh Đông Á. Trong bối cảnh Việt Nam cụ thể, nữ sinh THCS chịu kép áp lực: vừa phải đạt thành tích học tập cao (theo Confucian achievement script), vừa phải đáp ứng kỳ vọng giới về tế nhị, kín đáo, thu mình trong giao tiếp xã hội (theo Confucian feminine script). Nam sinh cùng tuổi chịu áp lực thành tích nhưng được phép biểu hiện chủ động xã hội. Small &amp; Blanc (2021) [8] mô tả tam giáo Nho-Phật-Đạo định hình các chuẩn mực ứng xử kéo dài qua nhiều thế hệ; những kỳ vọng giới này đặc biệt nghiêm ngặt trong môi trường học đường dưới sự giám sát của giáo viên + gia đình. Đến 16–29 tuổi (mẫu Jefferies), một bộ phận nữ thanh niên đã rời ghế nhà trường, vào môi trường lao động độc lập hơn — áp lực giới giảm xuống.</w:t>
       </w:r>
     </w:p>
     <w:p>
@@ -1519,7 +1519,7 @@
           <w:rFonts w:ascii="Times New Roman" w:hAnsi="Times New Roman"/>
           <w:sz w:val="22"/>
         </w:rPr>
-        <w:t>[2] Cole DA, Tram JM, Martin JM, Hoffman KB, Ruiz MD, Jacquez FM, Maschman TL. (2002). Individual differences in the emergence of depressive symptoms in children and adolescents: A longitudinal investigation of parent and child reports. Journal of Abnormal Psychology, 111(1), 156–165. PMID: 11866169.</w:t>
+        <w:t>[2] Hankin BL, Mermelstein R, Roesch L. (2007). Sex differences in adolescent depression: Stress exposure and reactivity models. Child Development, 78(1), 279–295. PMID: 17328705.</w:t>
       </w:r>
     </w:p>
     <w:p>
@@ -1532,7 +1532,7 @@
           <w:rFonts w:ascii="Times New Roman" w:hAnsi="Times New Roman"/>
           <w:sz w:val="22"/>
         </w:rPr>
-        <w:t>[3] Rapee RM, Schniering CA, Hudson JL. (2009). Anxiety disorders during childhood and adolescence: Origins and treatment. Annual Review of Clinical Psychology, 5, 311–341. DOI: 10.1146/annurev.clinpsy.032408.153628. PMID: 19152496.</w:t>
+        <w:t>[3] McLean CP, Anderson ER. (2009). Brave men and timid women? A review of the gender differences in fear and anxiety. Clinical Psychology Review, 29(6), 496–505. PMID: 19541399.</w:t>
       </w:r>
     </w:p>
     <w:p>
@@ -1558,7 +1558,7 @@
           <w:rFonts w:ascii="Times New Roman" w:hAnsi="Times New Roman"/>
           <w:sz w:val="22"/>
         </w:rPr>
-        <w:t>[5] Rose AJ. (2002). Co-rumination in the friendships of girls and boys. Child Development, 73(6), 1830–1843. PMID: 12487497. DOI: 10.1111/1467-8624.00509.</w:t>
+        <w:t>[5] Kessler RC, Berglund P, Demler O, Jin R, Merikangas KR, Walters EE. (2005). Lifetime prevalence and age-of-onset distributions of DSM-IV disorders in the National Comorbidity Survey Replication. Archives of General Psychiatry, 62(6), 593–602. PMID: 15939837. DOI: 10.1001/archpsyc.62.6.593.</w:t>
       </w:r>
     </w:p>
     <w:p>
@@ -1571,7 +1571,7 @@
           <w:rFonts w:ascii="Times New Roman" w:hAnsi="Times New Roman"/>
           <w:sz w:val="22"/>
         </w:rPr>
-        <w:t>[6] Stankov L. (2010). Unforgiving Confucian culture: A breeding ground for high academic achievement, test anxiety and self-doubt? Learning and Individual Differences, 20(6), 555–563. DOI: 10.1016/j.lindif.2010.05.003.</w:t>
+        <w:t>[6] Rose AJ. (2002). Co-rumination in the friendships of girls and boys. Child Development, 73(6), 1830–1843. PMID: 12487497. DOI: 10.1111/1467-8624.00509.</w:t>
       </w:r>
     </w:p>
     <w:p>
@@ -1584,7 +1584,20 @@
           <w:rFonts w:ascii="Times New Roman" w:hAnsi="Times New Roman"/>
           <w:sz w:val="22"/>
         </w:rPr>
-        <w:t>[7] Small S, Blanc J. (2021). Mental Health During COVID-19: Tam Giao and Vietnam's Response. Frontiers in Psychiatry, 11, 589618. DOI: 10.3389/fpsyt.2020.589618. PMID: 33536961.</w:t>
+        <w:t>[7] Stankov L. (2010). Unforgiving Confucian culture: A breeding ground for high academic achievement, test anxiety and self-doubt? Learning and Individual Differences, 20(6), 555–563. DOI: 10.1016/j.lindif.2010.05.003.</w:t>
+      </w:r>
+    </w:p>
+    <w:p>
+      <w:pPr>
+        <w:spacing w:after="120"/>
+        <w:ind w:left="425" w:hanging="425"/>
+      </w:pPr>
+      <w:r>
+        <w:rPr>
+          <w:rFonts w:ascii="Times New Roman" w:hAnsi="Times New Roman"/>
+          <w:sz w:val="22"/>
+        </w:rPr>
+        <w:t>[8] Small S, Blanc J. (2021). Mental Health During COVID-19: Tam Giao and Vietnam's Response. Frontiers in Psychiatry, 11, 589618. DOI: 10.3389/fpsyt.2020.589618. PMID: 33536961.</w:t>
       </w:r>
     </w:p>
     <w:p>

</xml_diff>

<commit_message>
TraLoiThayNMD v3 polished: fix factual error Vietnam ranking (was 'thấp thứ 2 sau Indonesia' = WRONG, thực ra THỨ 4 từ thấp lên trong 7 quốc gia) + add 6 transitional bridges between luận chứng + 2 sub-bullets explaining 2-group structure; 48/48 methods PASS, 3453 từ
</commit_message>
<xml_diff>
--- a/bai-bao-Q1/TraLoiThayNMD_GenderSAD_Q3Q4_08062026.docx
+++ b/bai-bao-Q1/TraLoiThayNMD_GenderSAD_Q3Q4_08062026.docx
@@ -617,7 +617,7 @@
               <w:rPr>
                 <w:sz w:val="20"/>
               </w:rPr>
-              <w:t>N = 984 (487 nam / 493 nữ); M = 22,68; SD = 11,77 (thấp thứ 2 sau Indonesia)</w:t>
+              <w:t>N = 984 (487 nam / 493 nữ); M = 22,68; SD = 11,77 — xếp thứ 4 trong 7 quốc gia (Indonesia 18,94 &lt; Nga 20,78 &lt; Trung Quốc 22,30 &lt; Việt Nam 22,68), dưới mức trung bình toàn mẫu 23,82</w:t>
             </w:r>
           </w:p>
         </w:tc>
@@ -648,7 +648,33 @@
           <w:i w:val="0"/>
           <w:sz w:val="24"/>
         </w:rPr>
-        <w:t>Câu hỏi của thầy thực sự rất sắc bén. Em đề xuất 6 luận chứng — bốn luận chứng về cơ chế phát triển + văn hóa, hai luận chứng về phương pháp luận — để giải thích sự không nhất quán này.</w:t>
+        <w:t>Câu hỏi của thầy thực sự rất sắc bén — vì nếu chỉ nhìn vào kết quả tổng thể của Jefferies (gender effect n.s.) mà chưa cân nhắc các điều kiện biên (boundary conditions), người đọc dễ kết luận rằng gender difference SAD không tồn tại, do đó kết quả của NCS có vẻ mâu thuẫn với y văn quốc tế. Em xin đề xuất 6 luận chứng — chia thành hai nhóm rõ rệt — để giải thích sự không nhất quán này:</w:t>
+      </w:r>
+    </w:p>
+    <w:p>
+      <w:pPr>
+        <w:spacing w:after="60"/>
+        <w:ind w:left="283"/>
+      </w:pPr>
+      <w:r>
+        <w:rPr>
+          <w:rFonts w:ascii="Times New Roman" w:hAnsi="Times New Roman"/>
+          <w:sz w:val="24"/>
+        </w:rPr>
+        <w:t>• Bốn luận chứng đầu (1–4) giải thích vì sao gender difference XUẤT HIỆN trong mẫu HS THCS Việt Nam — đây là các cơ chế tâm lý-phát triển-văn hóa làm cho nữ sinh 11–14 tuổi đặc biệt dễ tổn thương SAD hơn nam.</w:t>
+      </w:r>
+    </w:p>
+    <w:p>
+      <w:pPr>
+        <w:spacing w:after="60"/>
+        <w:ind w:left="283"/>
+      </w:pPr>
+      <w:r>
+        <w:rPr>
+          <w:rFonts w:ascii="Times New Roman" w:hAnsi="Times New Roman"/>
+          <w:sz w:val="24"/>
+        </w:rPr>
+        <w:t>• Hai luận chứng cuối (5–6) giải thích vì sao gender difference KHÔNG XUẤT HIỆN trong mẫu Jefferies — đây là các yếu tố phương pháp luận làm cho khác biệt giới khó được phát hiện dù có thể tồn tại trong dân số.</w:t>
       </w:r>
     </w:p>
     <w:p>
@@ -705,7 +731,22 @@
           <w:color w:val="2E74B5"/>
           <w:sz w:val="24"/>
         </w:rPr>
-        <w:t>Luận chứng 2 — Co-rumination peak ở giữa vị thành niên (Rose 2002)</w:t>
+        <w:t>Luận chứng 2 — Co-rumination đạt đỉnh ở giữa vị thành niên, đặc biệt ở nữ (Rose 2002)</w:t>
+      </w:r>
+    </w:p>
+    <w:p>
+      <w:pPr>
+        <w:spacing w:after="120"/>
+        <w:ind w:firstLine="425"/>
+        <w:jc w:val="both"/>
+      </w:pPr>
+      <w:r>
+        <w:rPr>
+          <w:rFonts w:ascii="Times New Roman" w:hAnsi="Times New Roman"/>
+          <w:i/>
+          <w:sz w:val="24"/>
+        </w:rPr>
+        <w:t>Bên cạnh cơ chế phát triển sinh học và xã hội-văn hóa nói chung, có một dạng tương tác xã hội đặc trưng của nữ sinh trung học cơ sở càng làm khuếch đại nguy cơ SAD:</w:t>
       </w:r>
     </w:p>
     <w:p>
@@ -734,7 +775,22 @@
           <w:color w:val="2E74B5"/>
           <w:sz w:val="24"/>
         </w:rPr>
-        <w:t>Luận chứng 3 — Kịch bản giới văn hóa Nho giáo Việt Nam ở tuổi học sinh THCS</w:t>
+        <w:t>Luận chứng 3 — Kịch bản giới văn hóa Nho giáo Việt Nam đặc biệt nghiêm ngặt ở tuổi học sinh THCS</w:t>
+      </w:r>
+    </w:p>
+    <w:p>
+      <w:pPr>
+        <w:spacing w:after="120"/>
+        <w:ind w:firstLine="425"/>
+        <w:jc w:val="both"/>
+      </w:pPr>
+      <w:r>
+        <w:rPr>
+          <w:rFonts w:ascii="Times New Roman" w:hAnsi="Times New Roman"/>
+          <w:i/>
+          <w:sz w:val="24"/>
+        </w:rPr>
+        <w:t>Hai cơ chế trên (phát triển sinh học + co-rumination) mang tính phổ quát qua các nền văn hóa. Bối cảnh Việt Nam còn áp đặt thêm một lớp áp lực giới đặc thù làm khuếch đại lo âu xã hội ở nữ:</w:t>
       </w:r>
     </w:p>
     <w:p>
@@ -763,7 +819,22 @@
           <w:color w:val="2E74B5"/>
           <w:sz w:val="24"/>
         </w:rPr>
-        <w:t>Luận chứng 4 — Bối cảnh học đường vs population-based panel</w:t>
+        <w:t>Luận chứng 4 — Bối cảnh đo lường khác nhau: học đường vs population-based panel</w:t>
+      </w:r>
+    </w:p>
+    <w:p>
+      <w:pPr>
+        <w:spacing w:after="120"/>
+        <w:ind w:firstLine="425"/>
+        <w:jc w:val="both"/>
+      </w:pPr>
+      <w:r>
+        <w:rPr>
+          <w:rFonts w:ascii="Times New Roman" w:hAnsi="Times New Roman"/>
+          <w:i/>
+          <w:sz w:val="24"/>
+        </w:rPr>
+        <w:t>Áp lực giới mà luận chứng 3 mô tả biểu hiện rõ nhất ở môi trường có sự giám sát xã hội cao — đây cũng là môi trường mà Q2 v1 chọn để đo lường:</w:t>
       </w:r>
     </w:p>
     <w:p>
@@ -792,7 +863,22 @@
           <w:color w:val="2E74B5"/>
           <w:sz w:val="24"/>
         </w:rPr>
-        <w:t>Luận chứng 5 — Khác biệt phương pháp luận: cỡ mẫu + công cụ + sai lệch mẫu</w:t>
+        <w:t>Luận chứng 5 — Khác biệt phương pháp luận: cỡ mẫu + công cụ + sai lệch mẫu trong nghiên cứu Jefferies</w:t>
+      </w:r>
+    </w:p>
+    <w:p>
+      <w:pPr>
+        <w:spacing w:after="120"/>
+        <w:ind w:firstLine="425"/>
+        <w:jc w:val="both"/>
+      </w:pPr>
+      <w:r>
+        <w:rPr>
+          <w:rFonts w:ascii="Times New Roman" w:hAnsi="Times New Roman"/>
+          <w:i/>
+          <w:sz w:val="24"/>
+        </w:rPr>
+        <w:t>Bốn luận chứng trên (1–4) tập trung vào cơ chế tâm lý-văn hóa giải thích vì sao gender difference XUẤT HIỆN ở mẫu Q2 v1. Hai luận chứng tiếp theo (5–6) chuyển sang phía Jefferies để giải thích vì sao gender difference KHÔNG ĐƯỢC PHÁT HIỆN ở mẫu của họ — đây là các yếu tố phương pháp luận quan trọng:</w:t>
       </w:r>
     </w:p>
     <w:p>
@@ -872,7 +958,7 @@
           <w:rFonts w:ascii="Times New Roman" w:hAnsi="Times New Roman"/>
           <w:sz w:val="24"/>
         </w:rPr>
-        <w:t>• Mẫu Jefferies cho Việt Nam có M = 22,68 — thấp thứ 2 trong 7 quốc gia (sau Indonesia M = 18,94). Mẫu Việt Nam của Jefferies có thể đặc thù low-anxiety subgroup do tự chọn lọc participants, làm mất khả năng phát hiện gender difference.</w:t>
+        <w:t>• Mẫu Jefferies cho Việt Nam có M = 22,68 — xếp thứ tư từ thấp lên trong 7 quốc gia (lần lượt: Indonesia 18,94 &lt; Nga 20,78 &lt; Trung Quốc 22,30 &lt; Việt Nam 22,68), thấp hơn mức trung bình toàn mẫu 23,82. Khả năng mẫu Việt Nam của Jefferies là một low-anxiety subgroup do tự chọn lọc participants — điều này làm giảm khả năng phát hiện gender difference vốn có thể tồn tại trong dân số thanh thiếu niên Việt Nam nói chung.</w:t>
       </w:r>
     </w:p>
     <w:p>
@@ -886,7 +972,22 @@
           <w:color w:val="2E74B5"/>
           <w:sz w:val="24"/>
         </w:rPr>
-        <w:t>Luận chứng 6 — Hiệu ứng tuổi và quá độ phát triển</w:t>
+        <w:t>Luận chứng 6 — Hiệu ứng tuổi mạnh áp đảo trong Jefferies + quá độ phát triển giữa hai mẫu</w:t>
+      </w:r>
+    </w:p>
+    <w:p>
+      <w:pPr>
+        <w:spacing w:after="120"/>
+        <w:ind w:firstLine="425"/>
+        <w:jc w:val="both"/>
+      </w:pPr>
+      <w:r>
+        <w:rPr>
+          <w:rFonts w:ascii="Times New Roman" w:hAnsi="Times New Roman"/>
+          <w:i/>
+          <w:sz w:val="24"/>
+        </w:rPr>
+        <w:t>Luận chứng cuối cùng — và có lẽ thuyết phục nhất — nằm chính trong kết quả của Jefferies:</w:t>
       </w:r>
     </w:p>
     <w:p>

</xml_diff>

<commit_message>
TraLoiThayNMD v4: add PHAN A bo sung — 5-khia-canh so sanh Q2v1 vs Jefferies (phuong phap / khung van hoa / cohort phat trien / thiet ke mau / cong cu) — balanced, acknowledge Jefferies strengths (cỡ mẫu + multi-country); 48/48 PASS, +400 words
</commit_message>
<xml_diff>
--- a/bai-bao-Q1/TraLoiThayNMD_GenderSAD_Q3Q4_08062026.docx
+++ b/bai-bao-Q1/TraLoiThayNMD_GenderSAD_Q3Q4_08062026.docx
@@ -124,6 +124,115 @@
           <w:sz w:val="24"/>
         </w:rPr>
         <w:t>• Việc bổ sung 2: Em đề xuất tiêu đề Q3 + Q4 tiềm năng — trình bày trong PHẦN C.</w:t>
+      </w:r>
+    </w:p>
+    <w:p>
+      <w:pPr>
+        <w:spacing w:before="320" w:after="120"/>
+      </w:pPr>
+      <w:r>
+        <w:rPr>
+          <w:rFonts w:ascii="Times New Roman" w:hAnsi="Times New Roman"/>
+          <w:b/>
+          <w:color w:val="C00000"/>
+          <w:sz w:val="28"/>
+        </w:rPr>
+        <w:t>PHẦN A bổ sung — Ghi nhận đánh giá của thầy về hàm lượng khoa học Q2 v1 so với Jefferies &amp; Ungar 2020</w:t>
+      </w:r>
+    </w:p>
+    <w:p>
+      <w:pPr>
+        <w:spacing w:after="120"/>
+        <w:ind w:firstLine="425"/>
+        <w:jc w:val="both"/>
+      </w:pPr>
+      <w:r>
+        <w:rPr>
+          <w:rFonts w:ascii="Times New Roman" w:hAnsi="Times New Roman"/>
+          <w:i w:val="0"/>
+          <w:sz w:val="24"/>
+        </w:rPr>
+        <w:t>Em cám ơn thầy đã ghi nhận hàm lượng khoa học gắn với văn hóa Á Đông và Việt Nam của Q2 v1. Em xin tóm lược năm khía cạnh để hai nghiên cứu bổ sung lẫn nhau hơn là cạnh tranh:</w:t>
+      </w:r>
+    </w:p>
+    <w:p>
+      <w:pPr>
+        <w:spacing w:after="60"/>
+        <w:ind w:left="283"/>
+      </w:pPr>
+      <w:r>
+        <w:rPr>
+          <w:rFonts w:ascii="Times New Roman" w:hAnsi="Times New Roman"/>
+          <w:sz w:val="24"/>
+        </w:rPr>
+        <w:t>• Phương pháp phân tích — Q2 v1 sử dụng SEM tích hợp với mô hình bậc cao YTNC + YTBV và kiểm định bất biến đa nhóm theo giới (configural → metric → scalar), trong khi Jefferies dùng ANOVA + t-test + chi-square (mô tả). Hai phương pháp có mức độ chặt chẽ thống kê khác nhau và phù hợp với câu hỏi nghiên cứu khác nhau.</w:t>
+      </w:r>
+    </w:p>
+    <w:p>
+      <w:pPr>
+        <w:spacing w:after="60"/>
+        <w:ind w:left="283"/>
+      </w:pPr>
+      <w:r>
+        <w:rPr>
+          <w:rFonts w:ascii="Times New Roman" w:hAnsi="Times New Roman"/>
+          <w:sz w:val="24"/>
+        </w:rPr>
+        <w:t>• Khung lý thuyết văn hóa — Q2 v1 áp dụng ba khung lý thuyết Á Đông cụ thể: tam giáo Nho-Phật-Đạo (Small &amp; Blanc 2021), văn hóa học thuật Nho giáo (Stankov 2010), co-rumination ở vị thành niên (Rose 2002). Jefferies dừng ở phân tích descriptive country effects — không khai thác sâu vào cơ chế văn hóa.</w:t>
+      </w:r>
+    </w:p>
+    <w:p>
+      <w:pPr>
+        <w:spacing w:after="60"/>
+        <w:ind w:left="283"/>
+      </w:pPr>
+      <w:r>
+        <w:rPr>
+          <w:rFonts w:ascii="Times New Roman" w:hAnsi="Times New Roman"/>
+          <w:sz w:val="24"/>
+        </w:rPr>
+        <w:t>• Bối cảnh phát triển — Q2 v1 tập trung vào cohort phát triển đồng nhất (HS THCS 11–14 tuổi, mọi đối tượng đang trong cùng giai đoạn dậy thì và xã hội hóa). Jefferies pool ba giai đoạn phát triển khác biệt (16–17 tuổi học sinh phổ thông, 18–24 tuổi sinh viên đại học, 25–29 tuổi đã đi làm) — phân tích pooled có thể che giấu các hiệu ứng đặc thù từng giai đoạn.</w:t>
+      </w:r>
+    </w:p>
+    <w:p>
+      <w:pPr>
+        <w:spacing w:after="60"/>
+        <w:ind w:left="283"/>
+      </w:pPr>
+      <w:r>
+        <w:rPr>
+          <w:rFonts w:ascii="Times New Roman" w:hAnsi="Times New Roman"/>
+          <w:sz w:val="24"/>
+        </w:rPr>
+        <w:t>• Thiết kế lấy mẫu — Q2 v1 sử dụng khảo sát học đường với purposive sampling 2 trường tại Hà Nội (đại diện đô thị + ngoại ô), gắn với bối cảnh giáo dục cụ thể. Jefferies là secondary analysis trên dataset thu thập bởi công ty market research Edelman/Unilever cho mục đích nghiên cứu thị trường mỹ phẩm — không gắn với bối cảnh lâm sàng hay giáo dục cụ thể nào.</w:t>
+      </w:r>
+    </w:p>
+    <w:p>
+      <w:pPr>
+        <w:spacing w:after="60"/>
+        <w:ind w:left="283"/>
+      </w:pPr>
+      <w:r>
+        <w:rPr>
+          <w:rFonts w:ascii="Times New Roman" w:hAnsi="Times New Roman"/>
+          <w:sz w:val="24"/>
+        </w:rPr>
+        <w:t>• Công cụ đo — Q2 v1 sử dụng RCADS-SocAD (DSM-5 aligned, 4 item tối ưu cho 11–14 tuổi). Jefferies sử dụng SIAS 20 item (Social Interaction Anxiety Scale, không DSM-5 aligned cụ thể). Hai công cụ đo cấu trúc gần kề nhưng không hoàn toàn trùng — RCADS-SocAD tập trung vào tiêu chí chẩn đoán SAD, SIAS tập trung vào tương tác xã hội tổng quát.</w:t>
+      </w:r>
+    </w:p>
+    <w:p>
+      <w:pPr>
+        <w:spacing w:after="120"/>
+        <w:ind w:firstLine="425"/>
+        <w:jc w:val="both"/>
+      </w:pPr>
+      <w:r>
+        <w:rPr>
+          <w:rFonts w:ascii="Times New Roman" w:hAnsi="Times New Roman"/>
+          <w:i w:val="0"/>
+          <w:sz w:val="24"/>
+        </w:rPr>
+        <w:t>Điểm mạnh của Jefferies là cỡ mẫu lớn (N = 6.825) và phạm vi đa quốc gia (7 nước) — Q2 v1 không tham vọng cạnh tranh ở hai khía cạnh này. Q2 v1 đóng góp bổ sung ở chiều sâu cơ chế tâm lý-văn hóa và phương pháp luận SEM tích hợp cho một cohort phát triển đồng nhất tại một quốc gia Á Đông cụ thể.</w:t>
       </w:r>
     </w:p>
     <w:p>

</xml_diff>